<commit_message>
Regenerate 平安银行 DOCX reports with CJK-fixed charts embedded
Co-Authored-By: Claude Sonnet 4.6 <noreply@anthropic.com>
</commit_message>
<xml_diff>
--- a/output/000001/000001_Q4_2025_Earnings_Update.docx
+++ b/output/000001/000001_Q4_2025_Earnings_Update.docx
@@ -1388,7 +1388,7 @@
       <w:r>
         <w:drawing>
           <wp:inline xmlns:a="http://schemas.openxmlformats.org/drawingml/2006/main" xmlns:pic="http://schemas.openxmlformats.org/drawingml/2006/picture">
-            <wp:extent cx="5029200" cy="3267240"/>
+            <wp:extent cx="5029200" cy="3264644"/>
             <wp:docPr id="1" name="Picture 1"/>
             <wp:cNvGraphicFramePr>
               <a:graphicFrameLocks noChangeAspect="1"/>
@@ -1409,7 +1409,7 @@
                   <pic:spPr>
                     <a:xfrm>
                       <a:off x="0" y="0"/>
-                      <a:ext cx="5029200" cy="3267240"/>
+                      <a:ext cx="5029200" cy="3264644"/>
                     </a:xfrm>
                     <a:prstGeom prst="rect"/>
                   </pic:spPr>
@@ -1504,7 +1504,7 @@
       <w:r>
         <w:drawing>
           <wp:inline xmlns:a="http://schemas.openxmlformats.org/drawingml/2006/main" xmlns:pic="http://schemas.openxmlformats.org/drawingml/2006/picture">
-            <wp:extent cx="5486400" cy="3557689"/>
+            <wp:extent cx="5486400" cy="3545191"/>
             <wp:docPr id="2" name="Picture 2"/>
             <wp:cNvGraphicFramePr>
               <a:graphicFrameLocks noChangeAspect="1"/>
@@ -1525,7 +1525,7 @@
                   <pic:spPr>
                     <a:xfrm>
                       <a:off x="0" y="0"/>
-                      <a:ext cx="5486400" cy="3557689"/>
+                      <a:ext cx="5486400" cy="3545191"/>
                     </a:xfrm>
                     <a:prstGeom prst="rect"/>
                   </pic:spPr>
@@ -1557,7 +1557,7 @@
       <w:r>
         <w:drawing>
           <wp:inline xmlns:a="http://schemas.openxmlformats.org/drawingml/2006/main" xmlns:pic="http://schemas.openxmlformats.org/drawingml/2006/picture">
-            <wp:extent cx="5029200" cy="3381704"/>
+            <wp:extent cx="5029200" cy="3365067"/>
             <wp:docPr id="3" name="Picture 3"/>
             <wp:cNvGraphicFramePr>
               <a:graphicFrameLocks noChangeAspect="1"/>
@@ -1578,7 +1578,7 @@
                   <pic:spPr>
                     <a:xfrm>
                       <a:off x="0" y="0"/>
-                      <a:ext cx="5029200" cy="3381704"/>
+                      <a:ext cx="5029200" cy="3365067"/>
                     </a:xfrm>
                     <a:prstGeom prst="rect"/>
                   </pic:spPr>
@@ -1649,7 +1649,7 @@
       <w:r>
         <w:drawing>
           <wp:inline xmlns:a="http://schemas.openxmlformats.org/drawingml/2006/main" xmlns:pic="http://schemas.openxmlformats.org/drawingml/2006/picture">
-            <wp:extent cx="5486400" cy="3557689"/>
+            <wp:extent cx="5486400" cy="3549515"/>
             <wp:docPr id="4" name="Picture 4"/>
             <wp:cNvGraphicFramePr>
               <a:graphicFrameLocks noChangeAspect="1"/>
@@ -1670,7 +1670,7 @@
                   <pic:spPr>
                     <a:xfrm>
                       <a:off x="0" y="0"/>
-                      <a:ext cx="5486400" cy="3557689"/>
+                      <a:ext cx="5486400" cy="3549515"/>
                     </a:xfrm>
                     <a:prstGeom prst="rect"/>
                   </pic:spPr>
@@ -1752,7 +1752,7 @@
       <w:r>
         <w:drawing>
           <wp:inline xmlns:a="http://schemas.openxmlformats.org/drawingml/2006/main" xmlns:pic="http://schemas.openxmlformats.org/drawingml/2006/picture">
-            <wp:extent cx="5029200" cy="3307294"/>
+            <wp:extent cx="5029200" cy="3314800"/>
             <wp:docPr id="5" name="Picture 5"/>
             <wp:cNvGraphicFramePr>
               <a:graphicFrameLocks noChangeAspect="1"/>
@@ -1773,7 +1773,7 @@
                   <pic:spPr>
                     <a:xfrm>
                       <a:off x="0" y="0"/>
-                      <a:ext cx="5029200" cy="3307294"/>
+                      <a:ext cx="5029200" cy="3314800"/>
                     </a:xfrm>
                     <a:prstGeom prst="rect"/>
                   </pic:spPr>
@@ -1844,7 +1844,7 @@
       <w:r>
         <w:drawing>
           <wp:inline xmlns:a="http://schemas.openxmlformats.org/drawingml/2006/main" xmlns:pic="http://schemas.openxmlformats.org/drawingml/2006/picture">
-            <wp:extent cx="5029200" cy="3395643"/>
+            <wp:extent cx="5029200" cy="3366485"/>
             <wp:docPr id="6" name="Picture 6"/>
             <wp:cNvGraphicFramePr>
               <a:graphicFrameLocks noChangeAspect="1"/>
@@ -1865,7 +1865,7 @@
                   <pic:spPr>
                     <a:xfrm>
                       <a:off x="0" y="0"/>
-                      <a:ext cx="5029200" cy="3395643"/>
+                      <a:ext cx="5029200" cy="3366485"/>
                     </a:xfrm>
                     <a:prstGeom prst="rect"/>
                   </pic:spPr>
@@ -1923,7 +1923,7 @@
       <w:r>
         <w:drawing>
           <wp:inline xmlns:a="http://schemas.openxmlformats.org/drawingml/2006/main" xmlns:pic="http://schemas.openxmlformats.org/drawingml/2006/picture">
-            <wp:extent cx="4572000" cy="3362950"/>
+            <wp:extent cx="4572000" cy="3368842"/>
             <wp:docPr id="7" name="Picture 7"/>
             <wp:cNvGraphicFramePr>
               <a:graphicFrameLocks noChangeAspect="1"/>
@@ -1944,7 +1944,7 @@
                   <pic:spPr>
                     <a:xfrm>
                       <a:off x="0" y="0"/>
-                      <a:ext cx="4572000" cy="3362950"/>
+                      <a:ext cx="4572000" cy="3368842"/>
                     </a:xfrm>
                     <a:prstGeom prst="rect"/>
                   </pic:spPr>
@@ -3269,7 +3269,7 @@
       <w:r>
         <w:drawing>
           <wp:inline xmlns:a="http://schemas.openxmlformats.org/drawingml/2006/main" xmlns:pic="http://schemas.openxmlformats.org/drawingml/2006/picture">
-            <wp:extent cx="5029200" cy="3395643"/>
+            <wp:extent cx="5029200" cy="3371990"/>
             <wp:docPr id="8" name="Picture 8"/>
             <wp:cNvGraphicFramePr>
               <a:graphicFrameLocks noChangeAspect="1"/>
@@ -3290,7 +3290,7 @@
                   <pic:spPr>
                     <a:xfrm>
                       <a:off x="0" y="0"/>
-                      <a:ext cx="5029200" cy="3395643"/>
+                      <a:ext cx="5029200" cy="3371990"/>
                     </a:xfrm>
                     <a:prstGeom prst="rect"/>
                   </pic:spPr>
@@ -4769,7 +4769,7 @@
       <w:r>
         <w:drawing>
           <wp:inline xmlns:a="http://schemas.openxmlformats.org/drawingml/2006/main" xmlns:pic="http://schemas.openxmlformats.org/drawingml/2006/picture">
-            <wp:extent cx="5486400" cy="3378446"/>
+            <wp:extent cx="5486400" cy="3362241"/>
             <wp:docPr id="9" name="Picture 9"/>
             <wp:cNvGraphicFramePr>
               <a:graphicFrameLocks noChangeAspect="1"/>
@@ -4790,7 +4790,7 @@
                   <pic:spPr>
                     <a:xfrm>
                       <a:off x="0" y="0"/>
-                      <a:ext cx="5486400" cy="3378446"/>
+                      <a:ext cx="5486400" cy="3362241"/>
                     </a:xfrm>
                     <a:prstGeom prst="rect"/>
                   </pic:spPr>
@@ -4822,7 +4822,7 @@
       <w:r>
         <w:drawing>
           <wp:inline xmlns:a="http://schemas.openxmlformats.org/drawingml/2006/main" xmlns:pic="http://schemas.openxmlformats.org/drawingml/2006/picture">
-            <wp:extent cx="5486400" cy="3378467"/>
+            <wp:extent cx="5486400" cy="3359857"/>
             <wp:docPr id="10" name="Picture 10"/>
             <wp:cNvGraphicFramePr>
               <a:graphicFrameLocks noChangeAspect="1"/>
@@ -4843,7 +4843,7 @@
                   <pic:spPr>
                     <a:xfrm>
                       <a:off x="0" y="0"/>
-                      <a:ext cx="5486400" cy="3378467"/>
+                      <a:ext cx="5486400" cy="3359857"/>
                     </a:xfrm>
                     <a:prstGeom prst="rect"/>
                   </pic:spPr>

</xml_diff>